<commit_message>
Started working on the dashboard, creating measures for total claims, total cost, admissions, hospital cases, pedriatic and percentage hospital and pharmacy cases
</commit_message>
<xml_diff>
--- a/GLICO Readme.docx
+++ b/GLICO Readme.docx
@@ -57,23 +57,7 @@
     </w:p>
     <w:p>
       <w:r>
-        <w:t xml:space="preserve">As a Data Analyst at GLICO with a background in Pharmacy, I aim to </w:t>
-      </w:r>
-      <w:proofErr w:type="spellStart"/>
-      <w:r>
-        <w:t>analyze</w:t>
-      </w:r>
-      <w:proofErr w:type="spellEnd"/>
-      <w:r>
-        <w:t xml:space="preserve"> claims data to identify patterns in healthcare utilization, detect potential abuse or fraud, and evaluate provider billing </w:t>
-      </w:r>
-      <w:proofErr w:type="spellStart"/>
-      <w:r>
-        <w:t>behavior</w:t>
-      </w:r>
-      <w:proofErr w:type="spellEnd"/>
-      <w:r>
-        <w:t xml:space="preserve"> in order to optimize cost control and improve decision-making.</w:t>
+        <w:t>As a Data Analyst at GLICO with a background in Pharmacy, I aim to analyze claims data to identify patterns in healthcare utilization, detect potential abuse or fraud, and evaluate provider billing behavior in order to optimize cost control and improve decision-making.</w:t>
       </w:r>
     </w:p>
     <w:p>
@@ -159,23 +143,7 @@
           <w:b/>
           <w:bCs/>
         </w:rPr>
-        <w:t xml:space="preserve"> Employee </w:t>
-      </w:r>
-      <w:proofErr w:type="spellStart"/>
-      <w:r>
-        <w:rPr>
-          <w:b/>
-          <w:bCs/>
-        </w:rPr>
-        <w:t>Behavior</w:t>
-      </w:r>
-      <w:proofErr w:type="spellEnd"/>
-      <w:r>
-        <w:rPr>
-          <w:b/>
-          <w:bCs/>
-        </w:rPr>
-        <w:t xml:space="preserve"> &amp; Utilization</w:t>
+        <w:t xml:space="preserve"> Employee Behavior &amp; Utilization</w:t>
       </w:r>
     </w:p>
     <w:p>
@@ -291,21 +259,12 @@
       <w:r>
         <w:t xml:space="preserve"> claiming </w:t>
       </w:r>
-      <w:proofErr w:type="spellStart"/>
-      <w:r>
-        <w:rPr>
-          <w:b/>
-          <w:bCs/>
-        </w:rPr>
-        <w:t>pediatric</w:t>
-      </w:r>
-      <w:proofErr w:type="spellEnd"/>
-      <w:r>
-        <w:rPr>
-          <w:b/>
-          <w:bCs/>
-        </w:rPr>
-        <w:t xml:space="preserve"> medications</w:t>
+      <w:r>
+        <w:rPr>
+          <w:b/>
+          <w:bCs/>
+        </w:rPr>
+        <w:t>pediatric medications</w:t>
       </w:r>
       <w:r>
         <w:t xml:space="preserve">? </w:t>
@@ -682,43 +641,18 @@
           <w:b/>
           <w:bCs/>
         </w:rPr>
-        <w:t xml:space="preserve">YES — for </w:t>
-      </w:r>
-      <w:proofErr w:type="spellStart"/>
-      <w:r>
-        <w:rPr>
-          <w:b/>
-          <w:bCs/>
-        </w:rPr>
-        <w:t>modeling</w:t>
-      </w:r>
-      <w:proofErr w:type="spellEnd"/>
-    </w:p>
-    <w:p>
-      <w:pPr>
-        <w:rPr>
-          <w:b/>
-          <w:bCs/>
-        </w:rPr>
-      </w:pPr>
-      <w:r>
-        <w:t xml:space="preserve">Standardizing my data making sure the values in the columns are the same, then I corrected the decimal places etc. Did some data cleaning in power query, added a few columns, calculated the expected total cost, cost variance, then I went to my EDA for more insights, I created a pivot table from the claims dataset the number of times each of the 172 workers at concentric visited a health facility and how much it costs, to see the visit patterns, then I created another to see how by how much each employee exceeds their monthly budget because for junior level, they have </w:t>
-      </w:r>
-      <w:proofErr w:type="spellStart"/>
-      <w:r>
-        <w:t>ghc</w:t>
-      </w:r>
-      <w:proofErr w:type="spellEnd"/>
-      <w:r>
-        <w:t xml:space="preserve"> 1500, mid 2500 senior 3500, and I created a new column for those who exceeded and those who were within limit, summary of the number of times they exceeded the limit in the month, and didn’t, then another pivot table for the top abusers, by how much they spent and by visit frequency, then I went to the healthcare providers section to see, which </w:t>
-      </w:r>
-      <w:proofErr w:type="spellStart"/>
-      <w:r>
-        <w:t>facilties</w:t>
-      </w:r>
-      <w:proofErr w:type="spellEnd"/>
-      <w:r>
-        <w:t xml:space="preserve"> charge more per visit, and in total</w:t>
+        <w:t>YES — for modeling</w:t>
+      </w:r>
+    </w:p>
+    <w:p>
+      <w:pPr>
+        <w:rPr>
+          <w:b/>
+          <w:bCs/>
+        </w:rPr>
+      </w:pPr>
+      <w:r>
+        <w:t>Standardizing my data making sure the values in the columns are the same, then I corrected the decimal places etc. Did some data cleaning in power query, added a few columns, calculated the expected total cost, cost variance, then I went to my EDA for more insights, I created a pivot table from the claims dataset the number of times each of the 172 workers at concentric visited a health facility and how much it costs, to see the visit patterns, then I created another to see how by how much each employee exceeds their monthly budget because for junior level, they have ghc 1500, mid 2500 senior 3500, and I created a new column for those who exceeded and those who were within limit, summary of the number of times they exceeded the limit in the month, and didn’t, then another pivot table for the top abusers, by how much they spent and by visit frequency, then I went to the healthcare providers section to see, which facilties charge more per visit, and in total</w:t>
       </w:r>
       <w:r>
         <w:t>, pivot table for monthly analysis to see if there are seasonal changes some visit depending on the month or season</w:t>
@@ -796,7 +730,7 @@
     <w:p>
       <w:r>
         <w:pict w14:anchorId="36FE3607">
-          <v:rect id="_x0000_i1057" style="width:0;height:1.5pt" o:hralign="center" o:hrstd="t" o:hr="t" fillcolor="#a0a0a0" stroked="f"/>
+          <v:rect id="_x0000_i1033" style="width:0;height:1.5pt" o:hralign="center" o:hrstd="t" o:hr="t" fillcolor="#a0a0a0" stroked="f"/>
         </w:pict>
       </w:r>
     </w:p>
@@ -836,7 +770,7 @@
     <w:p>
       <w:r>
         <w:pict w14:anchorId="516B69C8">
-          <v:rect id="_x0000_i1058" style="width:0;height:1.5pt" o:hralign="center" o:hrstd="t" o:hr="t" fillcolor="#a0a0a0" stroked="f"/>
+          <v:rect id="_x0000_i1034" style="width:0;height:1.5pt" o:hralign="center" o:hrstd="t" o:hr="t" fillcolor="#a0a0a0" stroked="f"/>
         </w:pict>
       </w:r>
     </w:p>
@@ -921,15 +855,7 @@
         </w:numPr>
       </w:pPr>
       <w:r>
-        <w:t xml:space="preserve">Some claims include </w:t>
-      </w:r>
-      <w:proofErr w:type="spellStart"/>
-      <w:r>
-        <w:t>pediatric</w:t>
-      </w:r>
-      <w:proofErr w:type="spellEnd"/>
-      <w:r>
-        <w:t xml:space="preserve"> medications for adult employees </w:t>
+        <w:t xml:space="preserve">Some claims include pediatric medications for adult employees </w:t>
       </w:r>
     </w:p>
     <w:p>
@@ -957,7 +883,7 @@
     <w:p>
       <w:r>
         <w:pict w14:anchorId="20C60330">
-          <v:rect id="_x0000_i1059" style="width:0;height:1.5pt" o:hralign="center" o:hrstd="t" o:hr="t" fillcolor="#a0a0a0" stroked="f"/>
+          <v:rect id="_x0000_i1035" style="width:0;height:1.5pt" o:hralign="center" o:hrstd="t" o:hr="t" fillcolor="#a0a0a0" stroked="f"/>
         </w:pict>
       </w:r>
     </w:p>
@@ -1030,21 +956,13 @@
         </w:numPr>
       </w:pPr>
       <w:r>
-        <w:t xml:space="preserve">Misuse (e.g., dependents, </w:t>
-      </w:r>
-      <w:proofErr w:type="spellStart"/>
-      <w:r>
-        <w:t>pediatric</w:t>
-      </w:r>
-      <w:proofErr w:type="spellEnd"/>
-      <w:r>
-        <w:t xml:space="preserve"> drugs) suggests policy gaps </w:t>
+        <w:t xml:space="preserve">Misuse (e.g., dependents, pediatric drugs) suggests policy gaps </w:t>
       </w:r>
     </w:p>
     <w:p>
       <w:r>
         <w:pict w14:anchorId="677500A2">
-          <v:rect id="_x0000_i1060" style="width:0;height:1.5pt" o:hralign="center" o:hrstd="t" o:hr="t" fillcolor="#a0a0a0" stroked="f"/>
+          <v:rect id="_x0000_i1036" style="width:0;height:1.5pt" o:hralign="center" o:hrstd="t" o:hr="t" fillcolor="#a0a0a0" stroked="f"/>
         </w:pict>
       </w:r>
     </w:p>
@@ -1144,15 +1062,7 @@
         </w:numPr>
       </w:pPr>
       <w:r>
-        <w:t xml:space="preserve">Enforce dependent verification for </w:t>
-      </w:r>
-      <w:proofErr w:type="spellStart"/>
-      <w:r>
-        <w:t>pediatric</w:t>
-      </w:r>
-      <w:proofErr w:type="spellEnd"/>
-      <w:r>
-        <w:t xml:space="preserve"> medications </w:t>
+        <w:t xml:space="preserve">Enforce dependent verification for pediatric medications </w:t>
       </w:r>
     </w:p>
     <w:p>
@@ -1176,8 +1086,577 @@
       <w:r>
         <w:t>Adjust plan design by job level or usage pattern</w:t>
       </w:r>
+      <w:r>
+        <w:br/>
+      </w:r>
+      <w:r>
+        <w:br/>
+      </w:r>
+    </w:p>
+    <w:p>
+      <w:r>
+        <w:t>DAX</w:t>
+      </w:r>
+    </w:p>
+    <w:p>
+      <w:pPr>
+        <w:pStyle w:val="ListParagraph"/>
+        <w:numPr>
+          <w:ilvl w:val="0"/>
+          <w:numId w:val="10"/>
+        </w:numPr>
+      </w:pPr>
+      <w:r>
+        <w:t>Monthly Limit = MAX(Employees_Table[Insurance_Limit_Monthly])</w:t>
+      </w:r>
+    </w:p>
+    <w:p>
+      <w:pPr>
+        <w:pStyle w:val="ListParagraph"/>
+        <w:numPr>
+          <w:ilvl w:val="0"/>
+          <w:numId w:val="10"/>
+        </w:numPr>
+      </w:pPr>
+      <w:r>
+        <w:t>Total Cost = SUM(Claims_2025[Total_Cost])</w:t>
+      </w:r>
+    </w:p>
+    <w:p>
+      <w:pPr>
+        <w:pStyle w:val="ListParagraph"/>
+        <w:numPr>
+          <w:ilvl w:val="0"/>
+          <w:numId w:val="10"/>
+        </w:numPr>
+      </w:pPr>
+      <w:r>
+        <w:t>Over Spend = [Total Cost] - [Monthly Limit]</w:t>
+      </w:r>
+    </w:p>
+    <w:p>
+      <w:pPr>
+        <w:pStyle w:val="ListParagraph"/>
+        <w:numPr>
+          <w:ilvl w:val="0"/>
+          <w:numId w:val="10"/>
+        </w:numPr>
+      </w:pPr>
+      <w:r>
+        <w:t>Employees Exceeding =</w:t>
+      </w:r>
+    </w:p>
+    <w:p>
+      <w:r>
+        <w:t>CALCULATE(</w:t>
+      </w:r>
+    </w:p>
+    <w:p>
+      <w:r>
+        <w:t>    DISTINCTCOUNT(Claims_2025[Employee_ID]),</w:t>
+      </w:r>
+    </w:p>
+    <w:p>
+      <w:r>
+        <w:t>    FILTER(</w:t>
+      </w:r>
+    </w:p>
+    <w:p>
+      <w:r>
+        <w:t>        VALUES(Claims_2025[Employee_ID]),</w:t>
+      </w:r>
+    </w:p>
+    <w:p>
+      <w:r>
+        <w:t>        [Over Spend] &gt; 0</w:t>
+      </w:r>
+    </w:p>
+    <w:p>
+      <w:r>
+        <w:t>    )</w:t>
+      </w:r>
+    </w:p>
+    <w:p>
+      <w:r>
+        <w:t>)</w:t>
+      </w:r>
+    </w:p>
+    <w:p>
+      <w:pPr>
+        <w:pStyle w:val="ListParagraph"/>
+        <w:numPr>
+          <w:ilvl w:val="0"/>
+          <w:numId w:val="10"/>
+        </w:numPr>
+        <w:shd w:val="clear" w:color="auto" w:fill="FFFFFF"/>
+        <w:spacing w:after="0" w:line="270" w:lineRule="atLeast"/>
+        <w:rPr>
+          <w:rFonts w:ascii="Consolas" w:eastAsia="Times New Roman" w:hAnsi="Consolas" w:cs="Times New Roman"/>
+          <w:color w:val="000000"/>
+          <w:kern w:val="0"/>
+          <w:sz w:val="18"/>
+          <w:szCs w:val="18"/>
+          <w:lang w:eastAsia="en-GB"/>
+          <w14:ligatures w14:val="none"/>
+        </w:rPr>
+      </w:pPr>
+      <w:r>
+        <w:rPr>
+          <w:rFonts w:ascii="Consolas" w:eastAsia="Times New Roman" w:hAnsi="Consolas" w:cs="Times New Roman"/>
+          <w:color w:val="000000"/>
+          <w:kern w:val="0"/>
+          <w:sz w:val="18"/>
+          <w:szCs w:val="18"/>
+          <w:lang w:eastAsia="en-GB"/>
+          <w14:ligatures w14:val="none"/>
+        </w:rPr>
+        <w:t xml:space="preserve">Total Claims = </w:t>
+      </w:r>
+      <w:r>
+        <w:rPr>
+          <w:rFonts w:ascii="Consolas" w:eastAsia="Times New Roman" w:hAnsi="Consolas" w:cs="Times New Roman"/>
+          <w:color w:val="3165BB"/>
+          <w:kern w:val="0"/>
+          <w:sz w:val="18"/>
+          <w:szCs w:val="18"/>
+          <w:lang w:eastAsia="en-GB"/>
+          <w14:ligatures w14:val="none"/>
+        </w:rPr>
+        <w:t>COUNT</w:t>
+      </w:r>
+      <w:r>
+        <w:rPr>
+          <w:rFonts w:ascii="Consolas" w:eastAsia="Times New Roman" w:hAnsi="Consolas" w:cs="Times New Roman"/>
+          <w:color w:val="000000"/>
+          <w:kern w:val="0"/>
+          <w:sz w:val="18"/>
+          <w:szCs w:val="18"/>
+          <w:lang w:eastAsia="en-GB"/>
+          <w14:ligatures w14:val="none"/>
+        </w:rPr>
+        <w:t>(</w:t>
+      </w:r>
+      <w:r>
+        <w:rPr>
+          <w:rFonts w:ascii="Consolas" w:eastAsia="Times New Roman" w:hAnsi="Consolas" w:cs="Times New Roman"/>
+          <w:color w:val="001080"/>
+          <w:kern w:val="0"/>
+          <w:sz w:val="18"/>
+          <w:szCs w:val="18"/>
+          <w:lang w:eastAsia="en-GB"/>
+          <w14:ligatures w14:val="none"/>
+        </w:rPr>
+        <w:t>Claims_2025[Claim_ID]</w:t>
+      </w:r>
+      <w:r>
+        <w:rPr>
+          <w:rFonts w:ascii="Consolas" w:eastAsia="Times New Roman" w:hAnsi="Consolas" w:cs="Times New Roman"/>
+          <w:color w:val="000000"/>
+          <w:kern w:val="0"/>
+          <w:sz w:val="18"/>
+          <w:szCs w:val="18"/>
+          <w:lang w:eastAsia="en-GB"/>
+          <w14:ligatures w14:val="none"/>
+        </w:rPr>
+        <w:t>)</w:t>
+      </w:r>
+    </w:p>
+    <w:p>
+      <w:pPr>
+        <w:pStyle w:val="ListParagraph"/>
+        <w:numPr>
+          <w:ilvl w:val="0"/>
+          <w:numId w:val="10"/>
+        </w:numPr>
+        <w:shd w:val="clear" w:color="auto" w:fill="FFFFFF"/>
+        <w:spacing w:after="0" w:line="270" w:lineRule="atLeast"/>
+        <w:rPr>
+          <w:rFonts w:ascii="Consolas" w:eastAsia="Times New Roman" w:hAnsi="Consolas" w:cs="Times New Roman"/>
+          <w:color w:val="000000"/>
+          <w:kern w:val="0"/>
+          <w:sz w:val="18"/>
+          <w:szCs w:val="18"/>
+          <w:lang w:eastAsia="en-GB"/>
+          <w14:ligatures w14:val="none"/>
+        </w:rPr>
+      </w:pPr>
+      <w:r>
+        <w:rPr>
+          <w:rFonts w:ascii="Consolas" w:eastAsia="Times New Roman" w:hAnsi="Consolas" w:cs="Times New Roman"/>
+          <w:color w:val="000000"/>
+          <w:kern w:val="0"/>
+          <w:sz w:val="18"/>
+          <w:szCs w:val="18"/>
+          <w:lang w:eastAsia="en-GB"/>
+          <w14:ligatures w14:val="none"/>
+        </w:rPr>
+        <w:t xml:space="preserve">Status = </w:t>
+      </w:r>
+      <w:r>
+        <w:rPr>
+          <w:rFonts w:ascii="Consolas" w:eastAsia="Times New Roman" w:hAnsi="Consolas" w:cs="Times New Roman"/>
+          <w:color w:val="3165BB"/>
+          <w:kern w:val="0"/>
+          <w:sz w:val="18"/>
+          <w:szCs w:val="18"/>
+          <w:lang w:eastAsia="en-GB"/>
+          <w14:ligatures w14:val="none"/>
+        </w:rPr>
+        <w:t>IF</w:t>
+      </w:r>
+      <w:r>
+        <w:rPr>
+          <w:rFonts w:ascii="Consolas" w:eastAsia="Times New Roman" w:hAnsi="Consolas" w:cs="Times New Roman"/>
+          <w:color w:val="000000"/>
+          <w:kern w:val="0"/>
+          <w:sz w:val="18"/>
+          <w:szCs w:val="18"/>
+          <w:lang w:eastAsia="en-GB"/>
+          <w14:ligatures w14:val="none"/>
+        </w:rPr>
+        <w:t>(</w:t>
+      </w:r>
+      <w:r>
+        <w:rPr>
+          <w:rFonts w:ascii="Consolas" w:eastAsia="Times New Roman" w:hAnsi="Consolas" w:cs="Times New Roman"/>
+          <w:color w:val="68349C"/>
+          <w:kern w:val="0"/>
+          <w:sz w:val="18"/>
+          <w:szCs w:val="18"/>
+          <w:lang w:eastAsia="en-GB"/>
+          <w14:ligatures w14:val="none"/>
+        </w:rPr>
+        <w:t>[Over Spend]</w:t>
+      </w:r>
+      <w:r>
+        <w:rPr>
+          <w:rFonts w:ascii="Consolas" w:eastAsia="Times New Roman" w:hAnsi="Consolas" w:cs="Times New Roman"/>
+          <w:color w:val="000000"/>
+          <w:kern w:val="0"/>
+          <w:sz w:val="18"/>
+          <w:szCs w:val="18"/>
+          <w:lang w:eastAsia="en-GB"/>
+          <w14:ligatures w14:val="none"/>
+        </w:rPr>
+        <w:t xml:space="preserve"> &gt; </w:t>
+      </w:r>
+      <w:r>
+        <w:rPr>
+          <w:rFonts w:ascii="Consolas" w:eastAsia="Times New Roman" w:hAnsi="Consolas" w:cs="Times New Roman"/>
+          <w:color w:val="098658"/>
+          <w:kern w:val="0"/>
+          <w:sz w:val="18"/>
+          <w:szCs w:val="18"/>
+          <w:lang w:eastAsia="en-GB"/>
+          <w14:ligatures w14:val="none"/>
+        </w:rPr>
+        <w:t>0</w:t>
+      </w:r>
+      <w:r>
+        <w:rPr>
+          <w:rFonts w:ascii="Consolas" w:eastAsia="Times New Roman" w:hAnsi="Consolas" w:cs="Times New Roman"/>
+          <w:color w:val="000000"/>
+          <w:kern w:val="0"/>
+          <w:sz w:val="18"/>
+          <w:szCs w:val="18"/>
+          <w:lang w:eastAsia="en-GB"/>
+          <w14:ligatures w14:val="none"/>
+        </w:rPr>
+        <w:t xml:space="preserve">, </w:t>
+      </w:r>
+      <w:r>
+        <w:rPr>
+          <w:rFonts w:ascii="Consolas" w:eastAsia="Times New Roman" w:hAnsi="Consolas" w:cs="Times New Roman"/>
+          <w:color w:val="A31515"/>
+          <w:kern w:val="0"/>
+          <w:sz w:val="18"/>
+          <w:szCs w:val="18"/>
+          <w:lang w:eastAsia="en-GB"/>
+          <w14:ligatures w14:val="none"/>
+        </w:rPr>
+        <w:t>"EXCEEDED"</w:t>
+      </w:r>
+      <w:r>
+        <w:rPr>
+          <w:rFonts w:ascii="Consolas" w:eastAsia="Times New Roman" w:hAnsi="Consolas" w:cs="Times New Roman"/>
+          <w:color w:val="000000"/>
+          <w:kern w:val="0"/>
+          <w:sz w:val="18"/>
+          <w:szCs w:val="18"/>
+          <w:lang w:eastAsia="en-GB"/>
+          <w14:ligatures w14:val="none"/>
+        </w:rPr>
+        <w:t xml:space="preserve">, </w:t>
+      </w:r>
+      <w:r>
+        <w:rPr>
+          <w:rFonts w:ascii="Consolas" w:eastAsia="Times New Roman" w:hAnsi="Consolas" w:cs="Times New Roman"/>
+          <w:color w:val="A31515"/>
+          <w:kern w:val="0"/>
+          <w:sz w:val="18"/>
+          <w:szCs w:val="18"/>
+          <w:lang w:eastAsia="en-GB"/>
+          <w14:ligatures w14:val="none"/>
+        </w:rPr>
+        <w:t>"OK"</w:t>
+      </w:r>
+      <w:r>
+        <w:rPr>
+          <w:rFonts w:ascii="Consolas" w:eastAsia="Times New Roman" w:hAnsi="Consolas" w:cs="Times New Roman"/>
+          <w:color w:val="000000"/>
+          <w:kern w:val="0"/>
+          <w:sz w:val="18"/>
+          <w:szCs w:val="18"/>
+          <w:lang w:eastAsia="en-GB"/>
+          <w14:ligatures w14:val="none"/>
+        </w:rPr>
+        <w:t>)</w:t>
+      </w:r>
+    </w:p>
+    <w:p>
+      <w:pPr>
+        <w:pStyle w:val="ListParagraph"/>
+        <w:shd w:val="clear" w:color="auto" w:fill="FFFFFF"/>
+        <w:spacing w:after="0" w:line="270" w:lineRule="atLeast"/>
+        <w:rPr>
+          <w:rFonts w:ascii="Consolas" w:eastAsia="Times New Roman" w:hAnsi="Consolas" w:cs="Times New Roman"/>
+          <w:color w:val="000000"/>
+          <w:kern w:val="0"/>
+          <w:sz w:val="18"/>
+          <w:szCs w:val="18"/>
+          <w:lang w:eastAsia="en-GB"/>
+          <w14:ligatures w14:val="none"/>
+        </w:rPr>
+      </w:pPr>
+    </w:p>
+    <w:p>
+      <w:pPr>
+        <w:rPr>
+          <w:rFonts w:ascii="Consolas" w:eastAsia="Times New Roman" w:hAnsi="Consolas" w:cs="Times New Roman"/>
+          <w:color w:val="000000"/>
+          <w:kern w:val="0"/>
+          <w:sz w:val="18"/>
+          <w:szCs w:val="18"/>
+          <w:lang w:eastAsia="en-GB"/>
+          <w14:ligatures w14:val="none"/>
+        </w:rPr>
+      </w:pPr>
+      <w:r>
+        <w:rPr>
+          <w:rFonts w:ascii="Consolas" w:eastAsia="Times New Roman" w:hAnsi="Consolas" w:cs="Times New Roman"/>
+          <w:color w:val="000000"/>
+          <w:kern w:val="0"/>
+          <w:sz w:val="18"/>
+          <w:szCs w:val="18"/>
+          <w:lang w:eastAsia="en-GB"/>
+          <w14:ligatures w14:val="none"/>
+        </w:rPr>
+        <w:br w:type="page"/>
+      </w:r>
+    </w:p>
+    <w:p>
+      <w:pPr>
+        <w:pStyle w:val="ListParagraph"/>
+        <w:numPr>
+          <w:ilvl w:val="0"/>
+          <w:numId w:val="10"/>
+        </w:numPr>
+        <w:rPr>
+          <w:rFonts w:ascii="Consolas" w:eastAsia="Times New Roman" w:hAnsi="Consolas" w:cs="Times New Roman"/>
+          <w:color w:val="000000"/>
+          <w:kern w:val="0"/>
+          <w:sz w:val="18"/>
+          <w:szCs w:val="18"/>
+          <w:lang w:eastAsia="en-GB"/>
+          <w14:ligatures w14:val="none"/>
+        </w:rPr>
+      </w:pPr>
+      <w:r>
+        <w:rPr>
+          <w:rFonts w:ascii="Consolas" w:eastAsia="Times New Roman" w:hAnsi="Consolas" w:cs="Times New Roman"/>
+          <w:color w:val="000000"/>
+          <w:kern w:val="0"/>
+          <w:sz w:val="18"/>
+          <w:szCs w:val="18"/>
+          <w:lang w:eastAsia="en-GB"/>
+          <w14:ligatures w14:val="none"/>
+        </w:rPr>
+        <w:lastRenderedPageBreak/>
+        <w:t xml:space="preserve">Exceeded Count = </w:t>
+      </w:r>
+    </w:p>
+    <w:p>
+      <w:pPr>
+        <w:pStyle w:val="ListParagraph"/>
+        <w:rPr>
+          <w:rFonts w:ascii="Consolas" w:eastAsia="Times New Roman" w:hAnsi="Consolas" w:cs="Times New Roman"/>
+          <w:color w:val="000000"/>
+          <w:kern w:val="0"/>
+          <w:sz w:val="18"/>
+          <w:szCs w:val="18"/>
+          <w:lang w:eastAsia="en-GB"/>
+          <w14:ligatures w14:val="none"/>
+        </w:rPr>
+      </w:pPr>
+      <w:r>
+        <w:rPr>
+          <w:rFonts w:ascii="Consolas" w:eastAsia="Times New Roman" w:hAnsi="Consolas" w:cs="Times New Roman"/>
+          <w:color w:val="000000"/>
+          <w:kern w:val="0"/>
+          <w:sz w:val="18"/>
+          <w:szCs w:val="18"/>
+          <w:lang w:eastAsia="en-GB"/>
+          <w14:ligatures w14:val="none"/>
+        </w:rPr>
+        <w:t>CALCULATE(</w:t>
+      </w:r>
+    </w:p>
+    <w:p>
+      <w:pPr>
+        <w:pStyle w:val="ListParagraph"/>
+        <w:rPr>
+          <w:rFonts w:ascii="Consolas" w:eastAsia="Times New Roman" w:hAnsi="Consolas" w:cs="Times New Roman"/>
+          <w:color w:val="000000"/>
+          <w:kern w:val="0"/>
+          <w:sz w:val="18"/>
+          <w:szCs w:val="18"/>
+          <w:lang w:eastAsia="en-GB"/>
+          <w14:ligatures w14:val="none"/>
+        </w:rPr>
+      </w:pPr>
+      <w:r>
+        <w:rPr>
+          <w:rFonts w:ascii="Consolas" w:eastAsia="Times New Roman" w:hAnsi="Consolas" w:cs="Times New Roman"/>
+          <w:color w:val="000000"/>
+          <w:kern w:val="0"/>
+          <w:sz w:val="18"/>
+          <w:szCs w:val="18"/>
+          <w:lang w:eastAsia="en-GB"/>
+          <w14:ligatures w14:val="none"/>
+        </w:rPr>
+        <w:t>    COUNTROWS(Claims_2025),</w:t>
+      </w:r>
+    </w:p>
+    <w:p>
+      <w:pPr>
+        <w:pStyle w:val="ListParagraph"/>
+        <w:rPr>
+          <w:rFonts w:ascii="Consolas" w:eastAsia="Times New Roman" w:hAnsi="Consolas" w:cs="Times New Roman"/>
+          <w:color w:val="000000"/>
+          <w:kern w:val="0"/>
+          <w:sz w:val="18"/>
+          <w:szCs w:val="18"/>
+          <w:lang w:eastAsia="en-GB"/>
+          <w14:ligatures w14:val="none"/>
+        </w:rPr>
+      </w:pPr>
+      <w:r>
+        <w:rPr>
+          <w:rFonts w:ascii="Consolas" w:eastAsia="Times New Roman" w:hAnsi="Consolas" w:cs="Times New Roman"/>
+          <w:color w:val="000000"/>
+          <w:kern w:val="0"/>
+          <w:sz w:val="18"/>
+          <w:szCs w:val="18"/>
+          <w:lang w:eastAsia="en-GB"/>
+          <w14:ligatures w14:val="none"/>
+        </w:rPr>
+        <w:t>    FILTER(Claims_2025, [Over Spend] &gt; 0)</w:t>
+      </w:r>
+    </w:p>
+    <w:p>
+      <w:pPr>
+        <w:pStyle w:val="ListParagraph"/>
+        <w:rPr>
+          <w:rFonts w:ascii="Consolas" w:eastAsia="Times New Roman" w:hAnsi="Consolas" w:cs="Times New Roman"/>
+          <w:color w:val="000000"/>
+          <w:kern w:val="0"/>
+          <w:sz w:val="18"/>
+          <w:szCs w:val="18"/>
+          <w:lang w:eastAsia="en-GB"/>
+          <w14:ligatures w14:val="none"/>
+        </w:rPr>
+      </w:pPr>
+      <w:r>
+        <w:rPr>
+          <w:rFonts w:ascii="Consolas" w:eastAsia="Times New Roman" w:hAnsi="Consolas" w:cs="Times New Roman"/>
+          <w:color w:val="000000"/>
+          <w:kern w:val="0"/>
+          <w:sz w:val="18"/>
+          <w:szCs w:val="18"/>
+          <w:lang w:eastAsia="en-GB"/>
+          <w14:ligatures w14:val="none"/>
+        </w:rPr>
+        <w:t>)</w:t>
+      </w:r>
+    </w:p>
+    <w:p>
+      <w:pPr>
+        <w:pStyle w:val="ListParagraph"/>
+        <w:shd w:val="clear" w:color="auto" w:fill="FFFFFF"/>
+        <w:spacing w:after="0" w:line="270" w:lineRule="atLeast"/>
+        <w:rPr>
+          <w:rFonts w:ascii="Consolas" w:eastAsia="Times New Roman" w:hAnsi="Consolas" w:cs="Times New Roman"/>
+          <w:color w:val="000000"/>
+          <w:kern w:val="0"/>
+          <w:sz w:val="18"/>
+          <w:szCs w:val="18"/>
+          <w:lang w:eastAsia="en-GB"/>
+          <w14:ligatures w14:val="none"/>
+        </w:rPr>
+      </w:pPr>
     </w:p>
     <w:p/>
+    <w:p>
+      <w:pPr>
+        <w:pStyle w:val="ListParagraph"/>
+        <w:numPr>
+          <w:ilvl w:val="0"/>
+          <w:numId w:val="10"/>
+        </w:numPr>
+      </w:pPr>
+      <w:r>
+        <w:t>Average Cost = AVERAGE(Claims_2025[Total_Cost])</w:t>
+      </w:r>
+    </w:p>
+    <w:p>
+      <w:r>
+        <w:t xml:space="preserve">New column in claims table:  </w:t>
+      </w:r>
+      <w:r>
+        <w:t>Month Year = FORMAT(Claims_</w:t>
+      </w:r>
+      <w:r>
+        <w:t>2025</w:t>
+      </w:r>
+      <w:r>
+        <w:t>[Visit_Date], "YYYY-MM")</w:t>
+      </w:r>
+    </w:p>
+    <w:p/>
+    <w:p/>
+    <w:p/>
+    <w:p>
+      <w:r>
+        <w:t xml:space="preserve">Card make it circle or nice or something and beautify the dates and all </w:t>
+      </w:r>
+    </w:p>
+    <w:p>
+      <w:r>
+        <w:t>Total exceeded should be more than 172</w:t>
+      </w:r>
+      <w:r>
+        <w:br/>
+      </w:r>
+      <w:r>
+        <w:br/>
+      </w:r>
+      <w:r>
+        <w:t>Employee Months = DISTINCTCOUNT(Employees[Employee_ID]) * 12</w:t>
+      </w:r>
+      <w:r>
+        <w:t xml:space="preserve"> (each of the 172 employees visit monthly for 12 months)</w:t>
+      </w:r>
+    </w:p>
     <w:sectPr>
       <w:pgSz w:w="11906" w:h="16838"/>
       <w:pgMar w:top="1440" w:right="1440" w:bottom="1440" w:left="1440" w:header="708" w:footer="708" w:gutter="0"/>
@@ -1191,6 +1670,95 @@
 <file path=word/numbering.xml><?xml version="1.0" encoding="utf-8"?>
 <w:numbering xmlns:wpc="http://schemas.microsoft.com/office/word/2010/wordprocessingCanvas" xmlns:cx="http://schemas.microsoft.com/office/drawing/2014/chartex" xmlns:cx1="http://schemas.microsoft.com/office/drawing/2015/9/8/chartex" xmlns:cx2="http://schemas.microsoft.com/office/drawing/2015/10/21/chartex" xmlns:cx3="http://schemas.microsoft.com/office/drawing/2016/5/9/chartex" xmlns:cx4="http://schemas.microsoft.com/office/drawing/2016/5/10/chartex" xmlns:cx5="http://schemas.microsoft.com/office/drawing/2016/5/11/chartex" xmlns:cx6="http://schemas.microsoft.com/office/drawing/2016/5/12/chartex" xmlns:cx7="http://schemas.microsoft.com/office/drawing/2016/5/13/chartex" xmlns:cx8="http://schemas.microsoft.com/office/drawing/2016/5/14/chartex" xmlns:mc="http://schemas.openxmlformats.org/markup-compatibility/2006" xmlns:aink="http://schemas.microsoft.com/office/drawing/2016/ink" xmlns:am3d="http://schemas.microsoft.com/office/drawing/2017/model3d" xmlns:o="urn:schemas-microsoft-com:office:office" xmlns:oel="http://schemas.microsoft.com/office/2019/extlst" xmlns:r="http://schemas.openxmlformats.org/officeDocument/2006/relationships" xmlns:m="http://schemas.openxmlformats.org/officeDocument/2006/math" xmlns:v="urn:schemas-microsoft-com:vml" xmlns:wp14="http://schemas.microsoft.com/office/word/2010/wordprocessingDrawing" xmlns:wp="http://schemas.openxmlformats.org/drawingml/2006/wordprocessingDrawing" xmlns:w10="urn:schemas-microsoft-com:office:word" xmlns:w="http://schemas.openxmlformats.org/wordprocessingml/2006/main" xmlns:w14="http://schemas.microsoft.com/office/word/2010/wordml" xmlns:w15="http://schemas.microsoft.com/office/word/2012/wordml" xmlns:w16cex="http://schemas.microsoft.com/office/word/2018/wordml/cex" xmlns:w16cid="http://schemas.microsoft.com/office/word/2016/wordml/cid" xmlns:w16="http://schemas.microsoft.com/office/word/2018/wordml" xmlns:w16du="http://schemas.microsoft.com/office/word/2023/wordml/word16du" xmlns:w16sdtdh="http://schemas.microsoft.com/office/word/2020/wordml/sdtdatahash" xmlns:w16sdtfl="http://schemas.microsoft.com/office/word/2024/wordml/sdtformatlock" xmlns:w16se="http://schemas.microsoft.com/office/word/2015/wordml/symex" xmlns:wpg="http://schemas.microsoft.com/office/word/2010/wordprocessingGroup" xmlns:wpi="http://schemas.microsoft.com/office/word/2010/wordprocessingInk" xmlns:wne="http://schemas.microsoft.com/office/word/2006/wordml" xmlns:wps="http://schemas.microsoft.com/office/word/2010/wordprocessingShape" mc:Ignorable="w14 w15 w16se w16cid w16 w16cex w16sdtdh w16sdtfl w16du wp14">
   <w:abstractNum w:abstractNumId="0" w15:restartNumberingAfterBreak="0">
+    <w:nsid w:val="04776BD0"/>
+    <w:multiLevelType w:val="hybridMultilevel"/>
+    <w:tmpl w:val="2BE089F2"/>
+    <w:lvl w:ilvl="0" w:tplc="0809000F">
+      <w:start w:val="1"/>
+      <w:numFmt w:val="decimal"/>
+      <w:lvlText w:val="%1."/>
+      <w:lvlJc w:val="left"/>
+      <w:pPr>
+        <w:ind w:left="720" w:hanging="360"/>
+      </w:pPr>
+      <w:rPr>
+        <w:rFonts w:hint="default"/>
+      </w:rPr>
+    </w:lvl>
+    <w:lvl w:ilvl="1" w:tplc="08090019" w:tentative="1">
+      <w:start w:val="1"/>
+      <w:numFmt w:val="lowerLetter"/>
+      <w:lvlText w:val="%2."/>
+      <w:lvlJc w:val="left"/>
+      <w:pPr>
+        <w:ind w:left="1440" w:hanging="360"/>
+      </w:pPr>
+    </w:lvl>
+    <w:lvl w:ilvl="2" w:tplc="0809001B" w:tentative="1">
+      <w:start w:val="1"/>
+      <w:numFmt w:val="lowerRoman"/>
+      <w:lvlText w:val="%3."/>
+      <w:lvlJc w:val="right"/>
+      <w:pPr>
+        <w:ind w:left="2160" w:hanging="180"/>
+      </w:pPr>
+    </w:lvl>
+    <w:lvl w:ilvl="3" w:tplc="0809000F" w:tentative="1">
+      <w:start w:val="1"/>
+      <w:numFmt w:val="decimal"/>
+      <w:lvlText w:val="%4."/>
+      <w:lvlJc w:val="left"/>
+      <w:pPr>
+        <w:ind w:left="2880" w:hanging="360"/>
+      </w:pPr>
+    </w:lvl>
+    <w:lvl w:ilvl="4" w:tplc="08090019" w:tentative="1">
+      <w:start w:val="1"/>
+      <w:numFmt w:val="lowerLetter"/>
+      <w:lvlText w:val="%5."/>
+      <w:lvlJc w:val="left"/>
+      <w:pPr>
+        <w:ind w:left="3600" w:hanging="360"/>
+      </w:pPr>
+    </w:lvl>
+    <w:lvl w:ilvl="5" w:tplc="0809001B" w:tentative="1">
+      <w:start w:val="1"/>
+      <w:numFmt w:val="lowerRoman"/>
+      <w:lvlText w:val="%6."/>
+      <w:lvlJc w:val="right"/>
+      <w:pPr>
+        <w:ind w:left="4320" w:hanging="180"/>
+      </w:pPr>
+    </w:lvl>
+    <w:lvl w:ilvl="6" w:tplc="0809000F" w:tentative="1">
+      <w:start w:val="1"/>
+      <w:numFmt w:val="decimal"/>
+      <w:lvlText w:val="%7."/>
+      <w:lvlJc w:val="left"/>
+      <w:pPr>
+        <w:ind w:left="5040" w:hanging="360"/>
+      </w:pPr>
+    </w:lvl>
+    <w:lvl w:ilvl="7" w:tplc="08090019" w:tentative="1">
+      <w:start w:val="1"/>
+      <w:numFmt w:val="lowerLetter"/>
+      <w:lvlText w:val="%8."/>
+      <w:lvlJc w:val="left"/>
+      <w:pPr>
+        <w:ind w:left="5760" w:hanging="360"/>
+      </w:pPr>
+    </w:lvl>
+    <w:lvl w:ilvl="8" w:tplc="0809001B" w:tentative="1">
+      <w:start w:val="1"/>
+      <w:numFmt w:val="lowerRoman"/>
+      <w:lvlText w:val="%9."/>
+      <w:lvlJc w:val="right"/>
+      <w:pPr>
+        <w:ind w:left="6480" w:hanging="180"/>
+      </w:pPr>
+    </w:lvl>
+  </w:abstractNum>
+  <w:abstractNum w:abstractNumId="1" w15:restartNumberingAfterBreak="0">
     <w:nsid w:val="09E7195E"/>
     <w:multiLevelType w:val="multilevel"/>
     <w:tmpl w:val="DF28C716"/>
@@ -1339,7 +1907,7 @@
       </w:rPr>
     </w:lvl>
   </w:abstractNum>
-  <w:abstractNum w:abstractNumId="1" w15:restartNumberingAfterBreak="0">
+  <w:abstractNum w:abstractNumId="2" w15:restartNumberingAfterBreak="0">
     <w:nsid w:val="139A25C9"/>
     <w:multiLevelType w:val="multilevel"/>
     <w:tmpl w:val="AEE2A1EC"/>
@@ -1488,7 +2056,7 @@
       </w:rPr>
     </w:lvl>
   </w:abstractNum>
-  <w:abstractNum w:abstractNumId="2" w15:restartNumberingAfterBreak="0">
+  <w:abstractNum w:abstractNumId="3" w15:restartNumberingAfterBreak="0">
     <w:nsid w:val="1BF82227"/>
     <w:multiLevelType w:val="multilevel"/>
     <w:tmpl w:val="D1F65286"/>
@@ -1637,7 +2205,7 @@
       </w:rPr>
     </w:lvl>
   </w:abstractNum>
-  <w:abstractNum w:abstractNumId="3" w15:restartNumberingAfterBreak="0">
+  <w:abstractNum w:abstractNumId="4" w15:restartNumberingAfterBreak="0">
     <w:nsid w:val="3B5E45A2"/>
     <w:multiLevelType w:val="multilevel"/>
     <w:tmpl w:val="4FE0B50E"/>
@@ -1786,7 +2354,7 @@
       </w:rPr>
     </w:lvl>
   </w:abstractNum>
-  <w:abstractNum w:abstractNumId="4" w15:restartNumberingAfterBreak="0">
+  <w:abstractNum w:abstractNumId="5" w15:restartNumberingAfterBreak="0">
     <w:nsid w:val="51DC1CFA"/>
     <w:multiLevelType w:val="multilevel"/>
     <w:tmpl w:val="D94A8AF2"/>
@@ -1935,7 +2503,7 @@
       </w:rPr>
     </w:lvl>
   </w:abstractNum>
-  <w:abstractNum w:abstractNumId="5" w15:restartNumberingAfterBreak="0">
+  <w:abstractNum w:abstractNumId="6" w15:restartNumberingAfterBreak="0">
     <w:nsid w:val="61FF481E"/>
     <w:multiLevelType w:val="multilevel"/>
     <w:tmpl w:val="D37CD81E"/>
@@ -2084,7 +2652,7 @@
       </w:rPr>
     </w:lvl>
   </w:abstractNum>
-  <w:abstractNum w:abstractNumId="6" w15:restartNumberingAfterBreak="0">
+  <w:abstractNum w:abstractNumId="7" w15:restartNumberingAfterBreak="0">
     <w:nsid w:val="6C4569E6"/>
     <w:multiLevelType w:val="multilevel"/>
     <w:tmpl w:val="BB32FB30"/>
@@ -2233,7 +2801,7 @@
       </w:rPr>
     </w:lvl>
   </w:abstractNum>
-  <w:abstractNum w:abstractNumId="7" w15:restartNumberingAfterBreak="0">
+  <w:abstractNum w:abstractNumId="8" w15:restartNumberingAfterBreak="0">
     <w:nsid w:val="6E4A6B3C"/>
     <w:multiLevelType w:val="multilevel"/>
     <w:tmpl w:val="7700A2AA"/>
@@ -2382,7 +2950,7 @@
       </w:rPr>
     </w:lvl>
   </w:abstractNum>
-  <w:abstractNum w:abstractNumId="8" w15:restartNumberingAfterBreak="0">
+  <w:abstractNum w:abstractNumId="9" w15:restartNumberingAfterBreak="0">
     <w:nsid w:val="7FB23298"/>
     <w:multiLevelType w:val="multilevel"/>
     <w:tmpl w:val="5A807D5A"/>
@@ -2532,31 +3100,34 @@
     </w:lvl>
   </w:abstractNum>
   <w:num w:numId="1" w16cid:durableId="411317953">
+    <w:abstractNumId w:val="3"/>
+  </w:num>
+  <w:num w:numId="2" w16cid:durableId="1748729847">
+    <w:abstractNumId w:val="5"/>
+  </w:num>
+  <w:num w:numId="3" w16cid:durableId="82919560">
+    <w:abstractNumId w:val="1"/>
+  </w:num>
+  <w:num w:numId="4" w16cid:durableId="147937659">
+    <w:abstractNumId w:val="7"/>
+  </w:num>
+  <w:num w:numId="5" w16cid:durableId="581257760">
     <w:abstractNumId w:val="2"/>
   </w:num>
-  <w:num w:numId="2" w16cid:durableId="1748729847">
+  <w:num w:numId="6" w16cid:durableId="1181046801">
+    <w:abstractNumId w:val="9"/>
+  </w:num>
+  <w:num w:numId="7" w16cid:durableId="1629622821">
+    <w:abstractNumId w:val="8"/>
+  </w:num>
+  <w:num w:numId="8" w16cid:durableId="670958337">
     <w:abstractNumId w:val="4"/>
   </w:num>
-  <w:num w:numId="3" w16cid:durableId="82919560">
-    <w:abstractNumId w:val="0"/>
-  </w:num>
-  <w:num w:numId="4" w16cid:durableId="147937659">
+  <w:num w:numId="9" w16cid:durableId="927470315">
     <w:abstractNumId w:val="6"/>
   </w:num>
-  <w:num w:numId="5" w16cid:durableId="581257760">
-    <w:abstractNumId w:val="1"/>
-  </w:num>
-  <w:num w:numId="6" w16cid:durableId="1181046801">
-    <w:abstractNumId w:val="8"/>
-  </w:num>
-  <w:num w:numId="7" w16cid:durableId="1629622821">
-    <w:abstractNumId w:val="7"/>
-  </w:num>
-  <w:num w:numId="8" w16cid:durableId="670958337">
-    <w:abstractNumId w:val="3"/>
-  </w:num>
-  <w:num w:numId="9" w16cid:durableId="927470315">
-    <w:abstractNumId w:val="5"/>
+  <w:num w:numId="10" w16cid:durableId="739521642">
+    <w:abstractNumId w:val="0"/>
   </w:num>
 </w:numbering>
 </file>
@@ -3164,6 +3735,7 @@
   <w:style w:type="character" w:default="1" w:styleId="DefaultParagraphFont">
     <w:name w:val="Default Paragraph Font"/>
     <w:uiPriority w:val="1"/>
+    <w:semiHidden/>
     <w:unhideWhenUsed/>
   </w:style>
   <w:style w:type="table" w:default="1" w:styleId="TableNormal">

</xml_diff>